<commit_message>
Add teaching and B.Tech supervision experience to THUAS application
Co-Authored-By: Claude Opus 5.5 <noreply@anthropic.com>
Claude-Session: https://claude.ai/code/session_01NjdMuB9buEkMmyf7HkyEWg
</commit_message>
<xml_diff>
--- a/applications/THUAS_Designer_Researcher_Value_Networks/Arunabha_Majumder_Cover_Letter_THUAS_Designer_Researcher.docx
+++ b/applications/THUAS_Designer_Researcher_Value_Networks/Arunabha_Majumder_Cover_Letter_THUAS_Designer_Researcher.docx
@@ -147,6 +147,18 @@
           <w:i w:val="0"/>
         </w:rPr>
         <w:t>I have experience contributing to the implementation of research plans. In the VIEXO project at Aalborg University, I took research questions from concept and design through experimental validation to publication. I designed and ran a 12-participant human study, including the statistical power justification, the ethics protocol, the data collection and the analysis pipeline, and the resulting dataset supports two journal submissions. Our work on energy-efficient assistive technology won the Best Research Paper Award at IFToMM ISRM 2026.</w:t>
+      </w:r>
+    </w:p>
+    <w:p>
+      <w:pPr>
+        <w:spacing w:after="160"/>
+      </w:pPr>
+      <w:r>
+        <w:rPr>
+          <w:b w:val="0"/>
+          <w:i w:val="0"/>
+        </w:rPr>
+        <w:t>Alongside my research, I teach and supervise Bachelor's (B.Tech) students at Aalborg University. This has given me direct experience in higher education and in working closely with students, which I understand is central to this role's contact with students and lecturer-researchers.</w:t>
       </w:r>
     </w:p>
     <w:p>

</xml_diff>